<commit_message>
docs: GK-105 atualiza evidências da Sprint 1
</commit_message>
<xml_diff>
--- a/docs/Plano-Sprint-1.docx
+++ b/docs/Plano-Sprint-1.docx
@@ -32,7 +32,7 @@
         <w:jc w:val="center"/>
       </w:pPr>
       <w:r>
-        <w:t xml:space="preserve">Equipe: Pedro Lucas Vaz de Andrade (PO e DevOps), Wagner Tiburcio da Silva Junior (QA) e Rodrigo Almeida Gomes (SM)</w:t>
+        <w:t>Equipe: Pedro Lucas Vaz de Andrade (PO e DevOps), Wagner Tiburcio da Silva Junior (QA) e Rodrigo Almeida Gomes (SM). Versão corrigida em 27/10/2026 com base no planejamento vigente do Jira: 9 histórias e 28 pontos.</w:t>
       </w:r>
     </w:p>
     <w:p>
@@ -60,6 +60,10 @@
         <w:gridCol w:w="6600"/>
       </w:tblGrid>
       <w:tr>
+        <w:trPr>
+          <w:cantSplit/>
+          <w:tblHeader w:val="true"/>
+        </w:trPr>
         <w:tc>
           <w:tcPr>
             <w:tcW w:type="dxa" w:w="3000"/>
@@ -116,6 +120,9 @@
         </w:tc>
       </w:tr>
       <w:tr>
+        <w:trPr>
+          <w:cantSplit/>
+        </w:trPr>
         <w:tc>
           <w:tcPr>
             <w:tcW w:type="dxa" w:w="3000"/>
@@ -170,6 +177,9 @@
         </w:tc>
       </w:tr>
       <w:tr>
+        <w:trPr>
+          <w:cantSplit/>
+        </w:trPr>
         <w:tc>
           <w:tcPr>
             <w:tcW w:type="dxa" w:w="3000"/>
@@ -224,6 +234,9 @@
         </w:tc>
       </w:tr>
       <w:tr>
+        <w:trPr>
+          <w:cantSplit/>
+        </w:trPr>
         <w:tc>
           <w:tcPr>
             <w:tcW w:type="dxa" w:w="3000"/>
@@ -278,6 +291,9 @@
         </w:tc>
       </w:tr>
       <w:tr>
+        <w:trPr>
+          <w:cantSplit/>
+        </w:trPr>
         <w:tc>
           <w:tcPr>
             <w:tcW w:type="dxa" w:w="3000"/>
@@ -332,6 +348,9 @@
         </w:tc>
       </w:tr>
       <w:tr>
+        <w:trPr>
+          <w:cantSplit/>
+        </w:trPr>
         <w:tc>
           <w:tcPr>
             <w:tcW w:type="dxa" w:w="3000"/>
@@ -419,7 +438,7 @@
         <w:spacing w:after="120"/>
       </w:pPr>
       <w:r>
-        <w:t xml:space="preserve">São 8 dias úteis. Pensando em cerca de 10 horas por semana de cada integrante e 1 ponto ≈ 3 horas, a capacidade fica em torno de 16 pontos. É uma estimativa inicial, porque é a primeira sprint e ainda não temos velocity. No Planning cada um confirma quanto tempo vai ter.</w:t>
+        <w:t>São 8 dias úteis. O planejamento vigente registrado no Jira mantém 9 histórias e 28 pontos. A disponibilidade real em horas de cada integrante ainda não foi registrada e deve ser confirmada pela equipe; não será substituída por uma conversão fixa de pontos em horas. Como esta é a primeira sprint, a velocity ainda será medida.</w:t>
       </w:r>
     </w:p>
     <w:p>
@@ -449,6 +468,10 @@
         <w:gridCol w:w="2800"/>
       </w:tblGrid>
       <w:tr>
+        <w:trPr>
+          <w:cantSplit/>
+          <w:tblHeader w:val="true"/>
+        </w:trPr>
         <w:tc>
           <w:tcPr>
             <w:tcW w:type="dxa" w:w="1200"/>
@@ -559,6 +582,9 @@
         </w:tc>
       </w:tr>
       <w:tr>
+        <w:trPr>
+          <w:cantSplit/>
+        </w:trPr>
         <w:tc>
           <w:tcPr>
             <w:tcW w:type="dxa" w:w="1200"/>
@@ -577,11 +603,7 @@
           </w:tcPr>
           <w:p>
             <w:r>
-              <w:rPr>
-                <w:b w:val="false"/>
-                <w:bCs w:val="false"/>
-              </w:rPr>
-              <w:t xml:space="preserve">GK-7</w:t>
+              <w:t>GK-7</w:t>
             </w:r>
           </w:p>
         </w:tc>
@@ -603,11 +625,7 @@
           </w:tcPr>
           <w:p>
             <w:r>
-              <w:rPr>
-                <w:b w:val="false"/>
-                <w:bCs w:val="false"/>
-              </w:rPr>
-              <w:t xml:space="preserve">Cadastro de cliente</w:t>
+              <w:t>Cadastro de cliente</w:t>
             </w:r>
           </w:p>
         </w:tc>
@@ -629,11 +647,7 @@
           </w:tcPr>
           <w:p>
             <w:r>
-              <w:rPr>
-                <w:b w:val="false"/>
-                <w:bCs w:val="false"/>
-              </w:rPr>
-              <w:t xml:space="preserve">3</w:t>
+              <w:t>3</w:t>
             </w:r>
           </w:p>
         </w:tc>
@@ -655,16 +669,15 @@
           </w:tcPr>
           <w:p>
             <w:r>
-              <w:rPr>
-                <w:b w:val="false"/>
-                <w:bCs w:val="false"/>
-              </w:rPr>
-              <w:t xml:space="preserve">definir no Planning</w:t>
+              <w:t>Rodrigo Almeida Gomes</w:t>
             </w:r>
           </w:p>
         </w:tc>
       </w:tr>
       <w:tr>
+        <w:trPr>
+          <w:cantSplit/>
+        </w:trPr>
         <w:tc>
           <w:tcPr>
             <w:tcW w:type="dxa" w:w="1200"/>
@@ -683,11 +696,7 @@
           </w:tcPr>
           <w:p>
             <w:r>
-              <w:rPr>
-                <w:b w:val="false"/>
-                <w:bCs w:val="false"/>
-              </w:rPr>
-              <w:t xml:space="preserve">GK-8</w:t>
+              <w:t>GK-8</w:t>
             </w:r>
           </w:p>
         </w:tc>
@@ -709,11 +718,7 @@
           </w:tcPr>
           <w:p>
             <w:r>
-              <w:rPr>
-                <w:b w:val="false"/>
-                <w:bCs w:val="false"/>
-              </w:rPr>
-              <w:t xml:space="preserve">Login</w:t>
+              <w:t>Login</w:t>
             </w:r>
           </w:p>
         </w:tc>
@@ -735,11 +740,7 @@
           </w:tcPr>
           <w:p>
             <w:r>
-              <w:rPr>
-                <w:b w:val="false"/>
-                <w:bCs w:val="false"/>
-              </w:rPr>
-              <w:t xml:space="preserve">5</w:t>
+              <w:t>5</w:t>
             </w:r>
           </w:p>
         </w:tc>
@@ -761,16 +762,15 @@
           </w:tcPr>
           <w:p>
             <w:r>
-              <w:rPr>
-                <w:b w:val="false"/>
-                <w:bCs w:val="false"/>
-              </w:rPr>
-              <w:t xml:space="preserve">definir no Planning</w:t>
+              <w:t>Rodrigo Almeida Gomes</w:t>
             </w:r>
           </w:p>
         </w:tc>
       </w:tr>
       <w:tr>
+        <w:trPr>
+          <w:cantSplit/>
+        </w:trPr>
         <w:tc>
           <w:tcPr>
             <w:tcW w:type="dxa" w:w="1200"/>
@@ -789,11 +789,7 @@
           </w:tcPr>
           <w:p>
             <w:r>
-              <w:rPr>
-                <w:b w:val="false"/>
-                <w:bCs w:val="false"/>
-              </w:rPr>
-              <w:t xml:space="preserve">GK-9</w:t>
+              <w:t>GK-9</w:t>
             </w:r>
           </w:p>
         </w:tc>
@@ -815,11 +811,7 @@
           </w:tcPr>
           <w:p>
             <w:r>
-              <w:rPr>
-                <w:b w:val="false"/>
-                <w:bCs w:val="false"/>
-              </w:rPr>
-              <w:t xml:space="preserve">Listagem de jogos</w:t>
+              <w:t>Listagem de jogos</w:t>
             </w:r>
           </w:p>
         </w:tc>
@@ -841,11 +833,7 @@
           </w:tcPr>
           <w:p>
             <w:r>
-              <w:rPr>
-                <w:b w:val="false"/>
-                <w:bCs w:val="false"/>
-              </w:rPr>
-              <w:t xml:space="preserve">5</w:t>
+              <w:t>5</w:t>
             </w:r>
           </w:p>
         </w:tc>
@@ -867,16 +855,15 @@
           </w:tcPr>
           <w:p>
             <w:r>
-              <w:rPr>
-                <w:b w:val="false"/>
-                <w:bCs w:val="false"/>
-              </w:rPr>
-              <w:t xml:space="preserve">definir no Planning</w:t>
+              <w:t>Wagner Tiburcio da Silva Junior</w:t>
             </w:r>
           </w:p>
         </w:tc>
       </w:tr>
       <w:tr>
+        <w:trPr>
+          <w:cantSplit/>
+        </w:trPr>
         <w:tc>
           <w:tcPr>
             <w:tcW w:type="dxa" w:w="1200"/>
@@ -895,11 +882,7 @@
           </w:tcPr>
           <w:p>
             <w:r>
-              <w:rPr>
-                <w:b w:val="false"/>
-                <w:bCs w:val="false"/>
-              </w:rPr>
-              <w:t xml:space="preserve">GK-10</w:t>
+              <w:t>GK-10</w:t>
             </w:r>
           </w:p>
         </w:tc>
@@ -921,11 +904,7 @@
           </w:tcPr>
           <w:p>
             <w:r>
-              <w:rPr>
-                <w:b w:val="false"/>
-                <w:bCs w:val="false"/>
-              </w:rPr>
-              <w:t xml:space="preserve">Detalhe do jogo</w:t>
+              <w:t>Detalhe do jogo</w:t>
             </w:r>
           </w:p>
         </w:tc>
@@ -947,11 +926,7 @@
           </w:tcPr>
           <w:p>
             <w:r>
-              <w:rPr>
-                <w:b w:val="false"/>
-                <w:bCs w:val="false"/>
-              </w:rPr>
-              <w:t xml:space="preserve">2</w:t>
+              <w:t>2</w:t>
             </w:r>
           </w:p>
         </w:tc>
@@ -973,16 +948,15 @@
           </w:tcPr>
           <w:p>
             <w:r>
-              <w:rPr>
-                <w:b w:val="false"/>
-                <w:bCs w:val="false"/>
-              </w:rPr>
-              <w:t xml:space="preserve">definir no Planning</w:t>
+              <w:t>Wagner Tiburcio da Silva Junior</w:t>
             </w:r>
           </w:p>
         </w:tc>
       </w:tr>
       <w:tr>
+        <w:trPr>
+          <w:cantSplit/>
+        </w:trPr>
         <w:tc>
           <w:tcPr>
             <w:tcW w:type="dxa" w:w="1200"/>
@@ -1001,11 +975,7 @@
           </w:tcPr>
           <w:p>
             <w:r>
-              <w:rPr>
-                <w:b w:val="false"/>
-                <w:bCs w:val="false"/>
-              </w:rPr>
-              <w:t xml:space="preserve"/>
+              <w:t>GK-57</w:t>
             </w:r>
           </w:p>
         </w:tc>
@@ -1027,11 +997,7 @@
           </w:tcPr>
           <w:p>
             <w:r>
-              <w:rPr>
-                <w:b w:val="false"/>
-                <w:bCs w:val="false"/>
-              </w:rPr>
-              <w:t xml:space="preserve">Total</w:t>
+              <w:t>Estruturação Banco de Dados</w:t>
             </w:r>
           </w:p>
         </w:tc>
@@ -1053,11 +1019,7 @@
           </w:tcPr>
           <w:p>
             <w:r>
-              <w:rPr>
-                <w:b w:val="false"/>
-                <w:bCs w:val="false"/>
-              </w:rPr>
-              <w:t xml:space="preserve">15</w:t>
+              <w:t>5</w:t>
             </w:r>
           </w:p>
         </w:tc>
@@ -1079,11 +1041,470 @@
           </w:tcPr>
           <w:p>
             <w:r>
-              <w:rPr>
-                <w:b w:val="false"/>
-                <w:bCs w:val="false"/>
-              </w:rPr>
-              <w:t xml:space="preserve"/>
+              <w:t>Pedro Lucas Vaz Andrade</w:t>
+            </w:r>
+          </w:p>
+        </w:tc>
+      </w:tr>
+      <w:tr>
+        <w:trPr>
+          <w:cantSplit/>
+        </w:trPr>
+        <w:tc>
+          <w:tcPr>
+            <w:tcW w:type="dxa" w:w="1200"/>
+            <w:tcBorders>
+              <w:top w:val="single" w:color="999999" w:sz="4"/>
+              <w:left w:val="single" w:color="999999" w:sz="4"/>
+              <w:bottom w:val="single" w:color="999999" w:sz="4"/>
+              <w:right w:val="single" w:color="999999" w:sz="4"/>
+            </w:tcBorders>
+            <w:tcMar>
+              <w:top w:type="dxa" w:w="60"/>
+              <w:left w:type="dxa" w:w="100"/>
+              <w:bottom w:type="dxa" w:w="60"/>
+              <w:right w:type="dxa" w:w="100"/>
+            </w:tcMar>
+          </w:tcPr>
+          <w:p>
+            <w:r>
+              <w:t>GK-58</w:t>
+            </w:r>
+          </w:p>
+        </w:tc>
+        <w:tc>
+          <w:tcPr>
+            <w:tcW w:type="dxa" w:w="4400"/>
+            <w:tcBorders>
+              <w:top w:val="single" w:color="999999" w:sz="4"/>
+              <w:left w:val="single" w:color="999999" w:sz="4"/>
+              <w:bottom w:val="single" w:color="999999" w:sz="4"/>
+              <w:right w:val="single" w:color="999999" w:sz="4"/>
+            </w:tcBorders>
+            <w:tcMar>
+              <w:top w:type="dxa" w:w="60"/>
+              <w:left w:type="dxa" w:w="100"/>
+              <w:bottom w:type="dxa" w:w="60"/>
+              <w:right w:type="dxa" w:w="100"/>
+            </w:tcMar>
+          </w:tcPr>
+          <w:p>
+            <w:r>
+              <w:t>Estudo do Banco de Dados</w:t>
+            </w:r>
+          </w:p>
+        </w:tc>
+        <w:tc>
+          <w:tcPr>
+            <w:tcW w:type="dxa" w:w="1200"/>
+            <w:tcBorders>
+              <w:top w:val="single" w:color="999999" w:sz="4"/>
+              <w:left w:val="single" w:color="999999" w:sz="4"/>
+              <w:bottom w:val="single" w:color="999999" w:sz="4"/>
+              <w:right w:val="single" w:color="999999" w:sz="4"/>
+            </w:tcBorders>
+            <w:tcMar>
+              <w:top w:type="dxa" w:w="60"/>
+              <w:left w:type="dxa" w:w="100"/>
+              <w:bottom w:type="dxa" w:w="60"/>
+              <w:right w:type="dxa" w:w="100"/>
+            </w:tcMar>
+          </w:tcPr>
+          <w:p>
+            <w:r>
+              <w:t>3</w:t>
+            </w:r>
+          </w:p>
+        </w:tc>
+        <w:tc>
+          <w:tcPr>
+            <w:tcW w:type="dxa" w:w="2800"/>
+            <w:tcBorders>
+              <w:top w:val="single" w:color="999999" w:sz="4"/>
+              <w:left w:val="single" w:color="999999" w:sz="4"/>
+              <w:bottom w:val="single" w:color="999999" w:sz="4"/>
+              <w:right w:val="single" w:color="999999" w:sz="4"/>
+            </w:tcBorders>
+            <w:tcMar>
+              <w:top w:type="dxa" w:w="60"/>
+              <w:left w:type="dxa" w:w="100"/>
+              <w:bottom w:type="dxa" w:w="60"/>
+              <w:right w:type="dxa" w:w="100"/>
+            </w:tcMar>
+          </w:tcPr>
+          <w:p>
+            <w:r>
+              <w:t>Pedro Lucas Vaz Andrade</w:t>
+            </w:r>
+          </w:p>
+        </w:tc>
+      </w:tr>
+      <w:tr>
+        <w:trPr>
+          <w:cantSplit/>
+        </w:trPr>
+        <w:tc>
+          <w:tcPr>
+            <w:tcW w:type="dxa" w:w="1200"/>
+            <w:tcBorders>
+              <w:top w:val="single" w:color="999999" w:sz="4"/>
+              <w:left w:val="single" w:color="999999" w:sz="4"/>
+              <w:bottom w:val="single" w:color="999999" w:sz="4"/>
+              <w:right w:val="single" w:color="999999" w:sz="4"/>
+            </w:tcBorders>
+            <w:tcMar>
+              <w:top w:type="dxa" w:w="60"/>
+              <w:left w:type="dxa" w:w="100"/>
+              <w:bottom w:type="dxa" w:w="60"/>
+              <w:right w:type="dxa" w:w="100"/>
+            </w:tcMar>
+          </w:tcPr>
+          <w:p>
+            <w:r>
+              <w:t>GK-60</w:t>
+            </w:r>
+          </w:p>
+        </w:tc>
+        <w:tc>
+          <w:tcPr>
+            <w:tcW w:type="dxa" w:w="4400"/>
+            <w:tcBorders>
+              <w:top w:val="single" w:color="999999" w:sz="4"/>
+              <w:left w:val="single" w:color="999999" w:sz="4"/>
+              <w:bottom w:val="single" w:color="999999" w:sz="4"/>
+              <w:right w:val="single" w:color="999999" w:sz="4"/>
+            </w:tcBorders>
+            <w:tcMar>
+              <w:top w:type="dxa" w:w="60"/>
+              <w:left w:type="dxa" w:w="100"/>
+              <w:bottom w:type="dxa" w:w="60"/>
+              <w:right w:type="dxa" w:w="100"/>
+            </w:tcMar>
+          </w:tcPr>
+          <w:p>
+            <w:r>
+              <w:t>Reunião da Equipe</w:t>
+            </w:r>
+          </w:p>
+        </w:tc>
+        <w:tc>
+          <w:tcPr>
+            <w:tcW w:type="dxa" w:w="1200"/>
+            <w:tcBorders>
+              <w:top w:val="single" w:color="999999" w:sz="4"/>
+              <w:left w:val="single" w:color="999999" w:sz="4"/>
+              <w:bottom w:val="single" w:color="999999" w:sz="4"/>
+              <w:right w:val="single" w:color="999999" w:sz="4"/>
+            </w:tcBorders>
+            <w:tcMar>
+              <w:top w:type="dxa" w:w="60"/>
+              <w:left w:type="dxa" w:w="100"/>
+              <w:bottom w:type="dxa" w:w="60"/>
+              <w:right w:type="dxa" w:w="100"/>
+            </w:tcMar>
+          </w:tcPr>
+          <w:p>
+            <w:r>
+              <w:t>1</w:t>
+            </w:r>
+          </w:p>
+        </w:tc>
+        <w:tc>
+          <w:tcPr>
+            <w:tcW w:type="dxa" w:w="2800"/>
+            <w:tcBorders>
+              <w:top w:val="single" w:color="999999" w:sz="4"/>
+              <w:left w:val="single" w:color="999999" w:sz="4"/>
+              <w:bottom w:val="single" w:color="999999" w:sz="4"/>
+              <w:right w:val="single" w:color="999999" w:sz="4"/>
+            </w:tcBorders>
+            <w:tcMar>
+              <w:top w:type="dxa" w:w="60"/>
+              <w:left w:type="dxa" w:w="100"/>
+              <w:bottom w:type="dxa" w:w="60"/>
+              <w:right w:type="dxa" w:w="100"/>
+            </w:tcMar>
+          </w:tcPr>
+          <w:p>
+            <w:r>
+              <w:t>Rodrigo Almeida Gomes</w:t>
+            </w:r>
+          </w:p>
+        </w:tc>
+      </w:tr>
+      <w:tr>
+        <w:trPr>
+          <w:cantSplit/>
+        </w:trPr>
+        <w:tc>
+          <w:tcPr>
+            <w:tcW w:type="dxa" w:w="1200"/>
+            <w:tcBorders>
+              <w:top w:val="single" w:color="999999" w:sz="4"/>
+              <w:left w:val="single" w:color="999999" w:sz="4"/>
+              <w:bottom w:val="single" w:color="999999" w:sz="4"/>
+              <w:right w:val="single" w:color="999999" w:sz="4"/>
+            </w:tcBorders>
+            <w:tcMar>
+              <w:top w:type="dxa" w:w="60"/>
+              <w:left w:type="dxa" w:w="100"/>
+              <w:bottom w:type="dxa" w:w="60"/>
+              <w:right w:type="dxa" w:w="100"/>
+            </w:tcMar>
+          </w:tcPr>
+          <w:p>
+            <w:r>
+              <w:t>GK-61</w:t>
+            </w:r>
+          </w:p>
+        </w:tc>
+        <w:tc>
+          <w:tcPr>
+            <w:tcW w:type="dxa" w:w="4400"/>
+            <w:tcBorders>
+              <w:top w:val="single" w:color="999999" w:sz="4"/>
+              <w:left w:val="single" w:color="999999" w:sz="4"/>
+              <w:bottom w:val="single" w:color="999999" w:sz="4"/>
+              <w:right w:val="single" w:color="999999" w:sz="4"/>
+            </w:tcBorders>
+            <w:tcMar>
+              <w:top w:type="dxa" w:w="60"/>
+              <w:left w:type="dxa" w:w="100"/>
+              <w:bottom w:type="dxa" w:w="60"/>
+              <w:right w:type="dxa" w:w="100"/>
+            </w:tcMar>
+          </w:tcPr>
+          <w:p>
+            <w:r>
+              <w:t>Resultados da Sprint</w:t>
+            </w:r>
+          </w:p>
+        </w:tc>
+        <w:tc>
+          <w:tcPr>
+            <w:tcW w:type="dxa" w:w="1200"/>
+            <w:tcBorders>
+              <w:top w:val="single" w:color="999999" w:sz="4"/>
+              <w:left w:val="single" w:color="999999" w:sz="4"/>
+              <w:bottom w:val="single" w:color="999999" w:sz="4"/>
+              <w:right w:val="single" w:color="999999" w:sz="4"/>
+            </w:tcBorders>
+            <w:tcMar>
+              <w:top w:type="dxa" w:w="60"/>
+              <w:left w:type="dxa" w:w="100"/>
+              <w:bottom w:type="dxa" w:w="60"/>
+              <w:right w:type="dxa" w:w="100"/>
+            </w:tcMar>
+          </w:tcPr>
+          <w:p>
+            <w:r>
+              <w:t>1</w:t>
+            </w:r>
+          </w:p>
+        </w:tc>
+        <w:tc>
+          <w:tcPr>
+            <w:tcW w:type="dxa" w:w="2800"/>
+            <w:tcBorders>
+              <w:top w:val="single" w:color="999999" w:sz="4"/>
+              <w:left w:val="single" w:color="999999" w:sz="4"/>
+              <w:bottom w:val="single" w:color="999999" w:sz="4"/>
+              <w:right w:val="single" w:color="999999" w:sz="4"/>
+            </w:tcBorders>
+            <w:tcMar>
+              <w:top w:type="dxa" w:w="60"/>
+              <w:left w:type="dxa" w:w="100"/>
+              <w:bottom w:type="dxa" w:w="60"/>
+              <w:right w:type="dxa" w:w="100"/>
+            </w:tcMar>
+          </w:tcPr>
+          <w:p>
+            <w:r>
+              <w:t>Rodrigo Almeida Gomes</w:t>
+            </w:r>
+          </w:p>
+        </w:tc>
+      </w:tr>
+      <w:tr>
+        <w:trPr>
+          <w:cantSplit/>
+        </w:trPr>
+        <w:tc>
+          <w:tcPr>
+            <w:tcW w:type="dxa" w:w="1200"/>
+            <w:tcBorders>
+              <w:top w:val="single" w:color="999999" w:sz="4"/>
+              <w:left w:val="single" w:color="999999" w:sz="4"/>
+              <w:bottom w:val="single" w:color="999999" w:sz="4"/>
+              <w:right w:val="single" w:color="999999" w:sz="4"/>
+            </w:tcBorders>
+            <w:tcMar>
+              <w:top w:type="dxa" w:w="60"/>
+              <w:left w:type="dxa" w:w="100"/>
+              <w:bottom w:type="dxa" w:w="60"/>
+              <w:right w:type="dxa" w:w="100"/>
+            </w:tcMar>
+          </w:tcPr>
+          <w:p>
+            <w:r>
+              <w:t>GK-63</w:t>
+            </w:r>
+          </w:p>
+        </w:tc>
+        <w:tc>
+          <w:tcPr>
+            <w:tcW w:type="dxa" w:w="4400"/>
+            <w:tcBorders>
+              <w:top w:val="single" w:color="999999" w:sz="4"/>
+              <w:left w:val="single" w:color="999999" w:sz="4"/>
+              <w:bottom w:val="single" w:color="999999" w:sz="4"/>
+              <w:right w:val="single" w:color="999999" w:sz="4"/>
+            </w:tcBorders>
+            <w:tcMar>
+              <w:top w:type="dxa" w:w="60"/>
+              <w:left w:type="dxa" w:w="100"/>
+              <w:bottom w:type="dxa" w:w="60"/>
+              <w:right w:type="dxa" w:w="100"/>
+            </w:tcMar>
+          </w:tcPr>
+          <w:p>
+            <w:r>
+              <w:t>Estruturação do Back-End</w:t>
+            </w:r>
+          </w:p>
+        </w:tc>
+        <w:tc>
+          <w:tcPr>
+            <w:tcW w:type="dxa" w:w="1200"/>
+            <w:tcBorders>
+              <w:top w:val="single" w:color="999999" w:sz="4"/>
+              <w:left w:val="single" w:color="999999" w:sz="4"/>
+              <w:bottom w:val="single" w:color="999999" w:sz="4"/>
+              <w:right w:val="single" w:color="999999" w:sz="4"/>
+            </w:tcBorders>
+            <w:tcMar>
+              <w:top w:type="dxa" w:w="60"/>
+              <w:left w:type="dxa" w:w="100"/>
+              <w:bottom w:type="dxa" w:w="60"/>
+              <w:right w:type="dxa" w:w="100"/>
+            </w:tcMar>
+          </w:tcPr>
+          <w:p>
+            <w:r>
+              <w:t>3</w:t>
+            </w:r>
+          </w:p>
+        </w:tc>
+        <w:tc>
+          <w:tcPr>
+            <w:tcW w:type="dxa" w:w="2800"/>
+            <w:tcBorders>
+              <w:top w:val="single" w:color="999999" w:sz="4"/>
+              <w:left w:val="single" w:color="999999" w:sz="4"/>
+              <w:bottom w:val="single" w:color="999999" w:sz="4"/>
+              <w:right w:val="single" w:color="999999" w:sz="4"/>
+            </w:tcBorders>
+            <w:tcMar>
+              <w:top w:type="dxa" w:w="60"/>
+              <w:left w:type="dxa" w:w="100"/>
+              <w:bottom w:type="dxa" w:w="60"/>
+              <w:right w:type="dxa" w:w="100"/>
+            </w:tcMar>
+          </w:tcPr>
+          <w:p>
+            <w:r>
+              <w:t>Pedro Lucas Vaz Andrade</w:t>
+            </w:r>
+          </w:p>
+        </w:tc>
+      </w:tr>
+      <w:tr>
+        <w:trPr>
+          <w:cantSplit/>
+        </w:trPr>
+        <w:tc>
+          <w:tcPr>
+            <w:tcW w:type="dxa" w:w="1200"/>
+            <w:tcBorders>
+              <w:top w:val="single" w:color="999999" w:sz="4"/>
+              <w:left w:val="single" w:color="999999" w:sz="4"/>
+              <w:bottom w:val="single" w:color="999999" w:sz="4"/>
+              <w:right w:val="single" w:color="999999" w:sz="4"/>
+            </w:tcBorders>
+            <w:tcMar>
+              <w:top w:type="dxa" w:w="60"/>
+              <w:left w:type="dxa" w:w="100"/>
+              <w:bottom w:type="dxa" w:w="60"/>
+              <w:right w:type="dxa" w:w="100"/>
+            </w:tcMar>
+          </w:tcPr>
+          <w:p>
+            <w:r/>
+          </w:p>
+        </w:tc>
+        <w:tc>
+          <w:tcPr>
+            <w:tcW w:type="dxa" w:w="4400"/>
+            <w:tcBorders>
+              <w:top w:val="single" w:color="999999" w:sz="4"/>
+              <w:left w:val="single" w:color="999999" w:sz="4"/>
+              <w:bottom w:val="single" w:color="999999" w:sz="4"/>
+              <w:right w:val="single" w:color="999999" w:sz="4"/>
+            </w:tcBorders>
+            <w:tcMar>
+              <w:top w:type="dxa" w:w="60"/>
+              <w:left w:type="dxa" w:w="100"/>
+              <w:bottom w:type="dxa" w:w="60"/>
+              <w:right w:type="dxa" w:w="100"/>
+            </w:tcMar>
+          </w:tcPr>
+          <w:p>
+            <w:r>
+              <w:t>Total</w:t>
+            </w:r>
+          </w:p>
+        </w:tc>
+        <w:tc>
+          <w:tcPr>
+            <w:tcW w:type="dxa" w:w="1200"/>
+            <w:tcBorders>
+              <w:top w:val="single" w:color="999999" w:sz="4"/>
+              <w:left w:val="single" w:color="999999" w:sz="4"/>
+              <w:bottom w:val="single" w:color="999999" w:sz="4"/>
+              <w:right w:val="single" w:color="999999" w:sz="4"/>
+            </w:tcBorders>
+            <w:tcMar>
+              <w:top w:type="dxa" w:w="60"/>
+              <w:left w:type="dxa" w:w="100"/>
+              <w:bottom w:type="dxa" w:w="60"/>
+              <w:right w:type="dxa" w:w="100"/>
+            </w:tcMar>
+          </w:tcPr>
+          <w:p>
+            <w:r>
+              <w:t>28</w:t>
+            </w:r>
+          </w:p>
+        </w:tc>
+        <w:tc>
+          <w:tcPr>
+            <w:tcW w:type="dxa" w:w="2800"/>
+            <w:tcBorders>
+              <w:top w:val="single" w:color="999999" w:sz="4"/>
+              <w:left w:val="single" w:color="999999" w:sz="4"/>
+              <w:bottom w:val="single" w:color="999999" w:sz="4"/>
+              <w:right w:val="single" w:color="999999" w:sz="4"/>
+            </w:tcBorders>
+            <w:tcMar>
+              <w:top w:type="dxa" w:w="60"/>
+              <w:left w:type="dxa" w:w="100"/>
+              <w:bottom w:type="dxa" w:w="60"/>
+              <w:right w:type="dxa" w:w="100"/>
+            </w:tcMar>
+          </w:tcPr>
+          <w:p>
+            <w:r>
+              <w:t>Equipe</w:t>
             </w:r>
           </w:p>
         </w:tc>
@@ -1094,7 +1515,7 @@
         <w:spacing w:after="120"/>
       </w:pPr>
       <w:r>
-        <w:t xml:space="preserve">Se a sprint apertar, a primeira história a sair é a GK-10, porque nenhuma outra depende dela.</w:t>
+        <w:t>A equipe manteve as 9 histórias e os 28 pontos conforme o planejamento vigente no Jira. Qualquer alteração de escopo deve ser decidida com o PO e registrada com a situação real das entregas.</w:t>
       </w:r>
     </w:p>
     <w:p>
@@ -1182,6 +1603,10 @@
         <w:gridCol w:w="4800"/>
       </w:tblGrid>
       <w:tr>
+        <w:trPr>
+          <w:cantSplit/>
+          <w:tblHeader w:val="true"/>
+        </w:trPr>
         <w:tc>
           <w:tcPr>
             <w:tcW w:type="dxa" w:w="4800"/>
@@ -1238,6 +1663,9 @@
         </w:tc>
       </w:tr>
       <w:tr>
+        <w:trPr>
+          <w:cantSplit/>
+        </w:trPr>
         <w:tc>
           <w:tcPr>
             <w:tcW w:type="dxa" w:w="4800"/>
@@ -1282,16 +1710,15 @@
           </w:tcPr>
           <w:p>
             <w:r>
-              <w:rPr>
-                <w:b w:val="false"/>
-                <w:bCs w:val="false"/>
-              </w:rPr>
-              <w:t xml:space="preserve">Começar com 15 pontos e ajustar na próxima sprint</w:t>
+              <w:t>Acompanhar os 28 pontos e usar o resultado real para calcular a primeira velocity</w:t>
             </w:r>
           </w:p>
         </w:tc>
       </w:tr>
       <w:tr>
+        <w:trPr>
+          <w:cantSplit/>
+        </w:trPr>
         <w:tc>
           <w:tcPr>
             <w:tcW w:type="dxa" w:w="4800"/>
@@ -1346,6 +1773,9 @@
         </w:tc>
       </w:tr>
       <w:tr>
+        <w:trPr>
+          <w:cantSplit/>
+        </w:trPr>
         <w:tc>
           <w:tcPr>
             <w:tcW w:type="dxa" w:w="4800"/>

</xml_diff>

<commit_message>
docs: GK-105 preserva capacidade original no plano da sprint
</commit_message>
<xml_diff>
--- a/docs/Plano-Sprint-1.docx
+++ b/docs/Plano-Sprint-1.docx
@@ -438,7 +438,7 @@
         <w:spacing w:after="120"/>
       </w:pPr>
       <w:r>
-        <w:t>São 8 dias úteis. O planejamento vigente registrado no Jira mantém 9 histórias e 28 pontos. A disponibilidade real em horas de cada integrante ainda não foi registrada e deve ser confirmada pela equipe; não será substituída por uma conversão fixa de pontos em horas. Como esta é a primeira sprint, a velocity ainda será medida.</w:t>
+        <w:t>São 8 dias úteis. A estimativa inicial de capacidade permanece em aproximadamente 16 pontos, conforme o acordo original baseado em cerca de 10 horas por semana de cada integrante e na referência de 1 ponto ≈ 3 horas. O planejamento vigente no Jira manteve 9 histórias e 28 pontos, portanto há uma diferença de 12 pontos acima da capacidade estimada. Como esta é a primeira sprint, a velocity será medida ao final.</w:t>
       </w:r>
     </w:p>
     <w:p>
@@ -1710,7 +1710,7 @@
           </w:tcPr>
           <w:p>
             <w:r>
-              <w:t>Acompanhar os 28 pontos e usar o resultado real para calcular a primeira velocity</w:t>
+              <w:t>Capacidade inicial estimada em aproximadamente 16 pontos; acompanhar os 28 pontos planejados e usar o resultado real para calcular a primeira velocity</w:t>
             </w:r>
           </w:p>
         </w:tc>

</xml_diff>